<commit_message>
Detailed labs 03-17 with step-by-step LTspice/Simulink instructions; regenerate Word
</commit_message>
<xml_diff>
--- a/Результаты/Лабораторная_03_Транзисторы_MOSFET_IGBT.docx
+++ b/Результаты/Лабораторная_03_Транзисторы_MOSFET_IGBT.docx
@@ -18,7 +18,7 @@
         <w:t>Тема:</w:t>
       </w:r>
       <w:r>
-        <w:t xml:space="preserve"> Выходные характеристики и динамика переключения силовых транзисторов.</w:t>
+        <w:t xml:space="preserve"> Выходные/передаточные характеристики и динамика переключения силовых транзисторов.</w:t>
       </w:r>
     </w:p>
     <w:p>
@@ -31,7 +31,18 @@
     </w:p>
     <w:p>
       <w:r>
-        <w:t>Снять выходные/передаточные характеристики MOSFET, исследовать процесс переключения на индуктивную нагрузку и оценить потери.</w:t>
+        <w:t xml:space="preserve">Снять характеристики MOSFET, исследовать переключение на индуктивную нагрузку (clamped inductive switching), оценить потери и влияние резистора затвора </w:t>
+      </w:r>
+      <w:r>
+        <w:rPr>
+          <w:rFonts w:ascii="Consolas" w:hAnsi="Consolas"/>
+          <w:color w:val="C03030"/>
+          <w:sz w:val="20"/>
+        </w:rPr>
+        <w:t>R_g</w:t>
+      </w:r>
+      <w:r>
+        <w:t>.</w:t>
       </w:r>
     </w:p>
     <w:p>
@@ -39,23 +50,128 @@
         <w:pStyle w:val="Heading2"/>
       </w:pPr>
       <w:r>
-        <w:t>Инструменты</w:t>
+        <w:t>Теория и расчёт (до симуляции)</w:t>
+      </w:r>
+    </w:p>
+    <w:p>
+      <w:r>
+        <w:t xml:space="preserve">Потери переключения за период: </w:t>
+      </w:r>
+      <w:r>
+        <w:rPr>
+          <w:rFonts w:ascii="Consolas" w:hAnsi="Consolas"/>
+          <w:color w:val="C03030"/>
+          <w:sz w:val="20"/>
+        </w:rPr>
+        <w:t>E = ∫ u_DS·i_D dt</w:t>
+      </w:r>
+      <w:r>
+        <w:t xml:space="preserve">, мощность </w:t>
+      </w:r>
+      <w:r>
+        <w:rPr>
+          <w:rFonts w:ascii="Consolas" w:hAnsi="Consolas"/>
+          <w:color w:val="C03030"/>
+          <w:sz w:val="20"/>
+        </w:rPr>
+        <w:t>P_sw = (E_on + E_off)·f_sw</w:t>
+      </w:r>
+      <w:r>
+        <w:t>.</w:t>
+      </w:r>
+    </w:p>
+    <w:p>
+      <w:r>
+        <w:t xml:space="preserve">Ориентир: при </w:t>
+      </w:r>
+      <w:r>
+        <w:rPr>
+          <w:rFonts w:ascii="Consolas" w:hAnsi="Consolas"/>
+          <w:color w:val="C03030"/>
+          <w:sz w:val="20"/>
+        </w:rPr>
+        <w:t>U_DS = 100 В</w:t>
+      </w:r>
+      <w:r>
+        <w:t xml:space="preserve">, </w:t>
+      </w:r>
+      <w:r>
+        <w:rPr>
+          <w:rFonts w:ascii="Consolas" w:hAnsi="Consolas"/>
+          <w:color w:val="C03030"/>
+          <w:sz w:val="20"/>
+        </w:rPr>
+        <w:t>I_D = 10 А</w:t>
+      </w:r>
+      <w:r>
+        <w:t xml:space="preserve">, </w:t>
+      </w:r>
+      <w:r>
+        <w:rPr>
+          <w:rFonts w:ascii="Consolas" w:hAnsi="Consolas"/>
+          <w:color w:val="C03030"/>
+          <w:sz w:val="20"/>
+        </w:rPr>
+        <w:t>t_перекл ≈ 50 нс</w:t>
+      </w:r>
+      <w:r>
+        <w:t>:</w:t>
       </w:r>
     </w:p>
     <w:p>
       <w:pPr>
-        <w:pStyle w:val="ListBullet"/>
+        <w:spacing w:after="0" w:before="0"/>
+        <w:ind w:left="240"/>
       </w:pPr>
       <w:r>
-        <w:t>LTspice (модели реальных MOSFET/IGBT из библиотеки).</w:t>
+        <w:rPr>
+          <w:rFonts w:ascii="Consolas" w:hAnsi="Consolas"/>
+          <w:sz w:val="20"/>
+        </w:rPr>
+        <w:t>E_on ≈ 0.5·100·10·50·10⁻⁹ = 25 мкДж</w:t>
       </w:r>
     </w:p>
     <w:p>
-      <w:pPr>
-        <w:pStyle w:val="ListBullet"/>
-      </w:pPr>
       <w:r>
-        <w:t>MATLAB/Simulink (опционально, для сравнения).</w:t>
+        <w:t xml:space="preserve">При </w:t>
+      </w:r>
+      <w:r>
+        <w:rPr>
+          <w:rFonts w:ascii="Consolas" w:hAnsi="Consolas"/>
+          <w:color w:val="C03030"/>
+          <w:sz w:val="20"/>
+        </w:rPr>
+        <w:t>f_sw = 50 кГц</w:t>
+      </w:r>
+      <w:r>
+        <w:t xml:space="preserve"> и </w:t>
+      </w:r>
+      <w:r>
+        <w:rPr>
+          <w:rFonts w:ascii="Consolas" w:hAnsi="Consolas"/>
+          <w:color w:val="C03030"/>
+          <w:sz w:val="20"/>
+        </w:rPr>
+        <w:t>E_on + E_off ≈ 50 мкДж</w:t>
+      </w:r>
+      <w:r>
+        <w:t xml:space="preserve">: </w:t>
+      </w:r>
+      <w:r>
+        <w:rPr>
+          <w:rFonts w:ascii="Consolas" w:hAnsi="Consolas"/>
+          <w:color w:val="C03030"/>
+          <w:sz w:val="20"/>
+        </w:rPr>
+        <w:t>P_sw ≈ 2.5 Вт</w:t>
+      </w:r>
+      <w:r>
+        <w:t>.</w:t>
+      </w:r>
+    </w:p>
+    <w:p>
+      <w:r>
+        <w:t>────────────────────────────────────────</w:t>
       </w:r>
     </w:p>
     <w:p>
@@ -63,7 +179,15 @@
         <w:pStyle w:val="Heading2"/>
       </w:pPr>
       <w:r>
-        <w:t>Задание</w:t>
+        <w:t>Часть A. Характеристики MOSFET (LTspice)</w:t>
+      </w:r>
+    </w:p>
+    <w:p>
+      <w:pPr>
+        <w:pStyle w:val="Heading3"/>
+      </w:pPr>
+      <w:r>
+        <w:t>A1. Передаточная характеристика I_D(V_GS)</w:t>
       </w:r>
     </w:p>
     <w:p>
@@ -71,13 +195,7 @@
         <w:pStyle w:val="ListNumber"/>
       </w:pPr>
       <w:r>
-        <w:rPr>
-          <w:b/>
-        </w:rPr>
-        <w:t>Передаточная характеристика.</w:t>
-      </w:r>
-      <w:r>
-        <w:t xml:space="preserve"> </w:t>
+        <w:t xml:space="preserve">Схема: транзистор (например </w:t>
       </w:r>
       <w:r>
         <w:rPr>
@@ -85,10 +203,43 @@
           <w:color w:val="C03030"/>
           <w:sz w:val="20"/>
         </w:rPr>
-        <w:t>.dc</w:t>
+        <w:t>IRF540</w:t>
       </w:r>
       <w:r>
-        <w:t xml:space="preserve"> развёртка V_GS, фиксированное V_DS. Определите V_GS(th) и крутизну.</w:t>
+        <w:t xml:space="preserve"> или </w:t>
+      </w:r>
+      <w:r>
+        <w:rPr>
+          <w:rFonts w:ascii="Consolas" w:hAnsi="Consolas"/>
+          <w:color w:val="C03030"/>
+          <w:sz w:val="20"/>
+        </w:rPr>
+        <w:t>nmos</w:t>
+      </w:r>
+      <w:r>
+        <w:t xml:space="preserve"> модель), сток через источник </w:t>
+      </w:r>
+      <w:r>
+        <w:rPr>
+          <w:rFonts w:ascii="Consolas" w:hAnsi="Consolas"/>
+          <w:color w:val="C03030"/>
+          <w:sz w:val="20"/>
+        </w:rPr>
+        <w:t>V_DS = 10 В</w:t>
+      </w:r>
+      <w:r>
+        <w:t xml:space="preserve">, на затвор — источник </w:t>
+      </w:r>
+      <w:r>
+        <w:rPr>
+          <w:rFonts w:ascii="Consolas" w:hAnsi="Consolas"/>
+          <w:color w:val="C03030"/>
+          <w:sz w:val="20"/>
+        </w:rPr>
+        <w:t>V_GS</w:t>
+      </w:r>
+      <w:r>
+        <w:t>.</w:t>
       </w:r>
     </w:p>
     <w:p>
@@ -96,13 +247,18 @@
         <w:pStyle w:val="ListNumber"/>
       </w:pPr>
       <w:r>
-        <w:rPr>
-          <w:b/>
-        </w:rPr>
-        <w:t>Выходные характеристики.</w:t>
+        <w:t xml:space="preserve">Директива: </w:t>
       </w:r>
       <w:r>
-        <w:t xml:space="preserve"> Семейство I_D(V_DS) при разных V_GS. Выделите линейную область и насыщение.</w:t>
+        <w:rPr>
+          <w:rFonts w:ascii="Consolas" w:hAnsi="Consolas"/>
+          <w:color w:val="C03030"/>
+          <w:sz w:val="20"/>
+        </w:rPr>
+        <w:t>.dc V_GS 0 10 0.05</w:t>
+      </w:r>
+      <w:r>
+        <w:t>.</w:t>
       </w:r>
     </w:p>
     <w:p>
@@ -110,13 +266,48 @@
         <w:pStyle w:val="ListNumber"/>
       </w:pPr>
       <w:r>
-        <w:rPr>
-          <w:b/>
-        </w:rPr>
-        <w:t>Переключение на индуктивную нагрузку (clamped inductive switching).</w:t>
+        <w:t xml:space="preserve">Постройте </w:t>
       </w:r>
       <w:r>
-        <w:t xml:space="preserve"> Соберите схему: источник, индуктивность, обратный диод, транзистор + драйвер с R_g. Подайте импульс на затвор.</w:t>
+        <w:rPr>
+          <w:rFonts w:ascii="Consolas" w:hAnsi="Consolas"/>
+          <w:color w:val="C03030"/>
+          <w:sz w:val="20"/>
+        </w:rPr>
+        <w:t>Id(M1)</w:t>
+      </w:r>
+      <w:r>
+        <w:t xml:space="preserve">. Найдите </w:t>
+      </w:r>
+      <w:r>
+        <w:rPr>
+          <w:rFonts w:ascii="Consolas" w:hAnsi="Consolas"/>
+          <w:color w:val="C03030"/>
+          <w:sz w:val="20"/>
+        </w:rPr>
+        <w:t>V_GS(th)</w:t>
+      </w:r>
+      <w:r>
+        <w:t xml:space="preserve"> (где ток начинает расти) и крутизну </w:t>
+      </w:r>
+      <w:r>
+        <w:rPr>
+          <w:rFonts w:ascii="Consolas" w:hAnsi="Consolas"/>
+          <w:color w:val="C03030"/>
+          <w:sz w:val="20"/>
+        </w:rPr>
+        <w:t>g_m = ΔI_D/ΔV_GS</w:t>
+      </w:r>
+      <w:r>
+        <w:t>.</w:t>
+      </w:r>
+    </w:p>
+    <w:p>
+      <w:pPr>
+        <w:pStyle w:val="Heading3"/>
+      </w:pPr>
+      <w:r>
+        <w:t>A2. Выходные характеристики I_D(V_DS)</w:t>
       </w:r>
     </w:p>
     <w:p>
@@ -124,7 +315,18 @@
         <w:pStyle w:val="ListNumber"/>
       </w:pPr>
       <w:r>
-        <w:t>Снимите осциллограммы V_DS, I_D, V_GS при включении и выключении. Измерьте t_on, t_off.</w:t>
+        <w:t xml:space="preserve">Двойная развёртка: </w:t>
+      </w:r>
+      <w:r>
+        <w:rPr>
+          <w:rFonts w:ascii="Consolas" w:hAnsi="Consolas"/>
+          <w:color w:val="C03030"/>
+          <w:sz w:val="20"/>
+        </w:rPr>
+        <w:t>.dc V_DS 0 20 0.1 V_GS 4 8 1</w:t>
+      </w:r>
+      <w:r>
+        <w:t>.</w:t>
       </w:r>
     </w:p>
     <w:p>
@@ -132,7 +334,31 @@
         <w:pStyle w:val="ListNumber"/>
       </w:pPr>
       <w:r>
-        <w:t>Повторите для двух значений R_g и сравните скорость/потери.</w:t>
+        <w:t xml:space="preserve">Получите семейство кривых для </w:t>
+      </w:r>
+      <w:r>
+        <w:rPr>
+          <w:rFonts w:ascii="Consolas" w:hAnsi="Consolas"/>
+          <w:color w:val="C03030"/>
+          <w:sz w:val="20"/>
+        </w:rPr>
+        <w:t>V_GS = 4…8 В</w:t>
+      </w:r>
+      <w:r>
+        <w:t>.</w:t>
+      </w:r>
+    </w:p>
+    <w:p>
+      <w:pPr>
+        <w:pStyle w:val="ListNumber"/>
+      </w:pPr>
+      <w:r>
+        <w:t>Отметьте омическую область и область насыщения.</w:t>
+      </w:r>
+    </w:p>
+    <w:p>
+      <w:r>
+        <w:t>────────────────────────────────────────</w:t>
       </w:r>
     </w:p>
     <w:p>
@@ -140,15 +366,23 @@
         <w:pStyle w:val="Heading2"/>
       </w:pPr>
       <w:r>
-        <w:t>Расчётная часть</w:t>
+        <w:t>Часть B. Переключение на индуктивную нагрузку (LTspice)</w:t>
       </w:r>
     </w:p>
     <w:p>
       <w:pPr>
-        <w:pStyle w:val="ListBullet"/>
+        <w:pStyle w:val="Heading3"/>
       </w:pPr>
       <w:r>
-        <w:t xml:space="preserve">Оцените потери переключения </w:t>
+        <w:t>B1. Схема (double-pulse test)</w:t>
+      </w:r>
+    </w:p>
+    <w:p>
+      <w:pPr>
+        <w:pStyle w:val="ListNumber"/>
+      </w:pPr>
+      <w:r>
+        <w:t xml:space="preserve">Питание </w:t>
       </w:r>
       <w:r>
         <w:rPr>
@@ -156,26 +390,377 @@
           <w:color w:val="C03030"/>
           <w:sz w:val="20"/>
         </w:rPr>
-        <w:t>E = ∫ V_DS·I_D dt</w:t>
+        <w:t>V1 = 100 В</w:t>
       </w:r>
       <w:r>
-        <w:t xml:space="preserve"> за интервал коммутации.</w:t>
+        <w:t>.</w:t>
       </w:r>
     </w:p>
     <w:p>
       <w:pPr>
-        <w:pStyle w:val="ListBullet"/>
+        <w:pStyle w:val="ListNumber"/>
       </w:pPr>
       <w:r>
-        <w:t>P_sw = (E_on + E_off)·f_sw для f_sw = 50 кГц.</w:t>
+        <w:t xml:space="preserve">Индуктивность нагрузки </w:t>
+      </w:r>
+      <w:r>
+        <w:rPr>
+          <w:rFonts w:ascii="Consolas" w:hAnsi="Consolas"/>
+          <w:color w:val="C03030"/>
+          <w:sz w:val="20"/>
+        </w:rPr>
+        <w:t>L = 200 мкГн</w:t>
+      </w:r>
+      <w:r>
+        <w:t xml:space="preserve"> от V1 к стоку.</w:t>
       </w:r>
     </w:p>
     <w:p>
       <w:pPr>
-        <w:pStyle w:val="ListBullet"/>
+        <w:pStyle w:val="ListNumber"/>
       </w:pPr>
       <w:r>
-        <w:t>Сравните MOSFET и IGBT (если доступны модели): кто выгоднее по суммарным потерям.</w:t>
+        <w:t xml:space="preserve">Антипараллельно L — обратный диод (fast, например </w:t>
+      </w:r>
+      <w:r>
+        <w:rPr>
+          <w:rFonts w:ascii="Consolas" w:hAnsi="Consolas"/>
+          <w:color w:val="C03030"/>
+          <w:sz w:val="20"/>
+        </w:rPr>
+        <w:t>MUR460</w:t>
+      </w:r>
+      <w:r>
+        <w:t>), катодом к V1.</w:t>
+      </w:r>
+    </w:p>
+    <w:p>
+      <w:pPr>
+        <w:pStyle w:val="ListNumber"/>
+      </w:pPr>
+      <w:r>
+        <w:t>Транзистор: сток к узлу L/диод, исток к земле.</w:t>
+      </w:r>
+    </w:p>
+    <w:p>
+      <w:pPr>
+        <w:pStyle w:val="ListNumber"/>
+      </w:pPr>
+      <w:r>
+        <w:t xml:space="preserve">Драйвер затвора: импульсный источник </w:t>
+      </w:r>
+      <w:r>
+        <w:rPr>
+          <w:rFonts w:ascii="Consolas" w:hAnsi="Consolas"/>
+          <w:color w:val="C03030"/>
+          <w:sz w:val="20"/>
+        </w:rPr>
+        <w:t>V_G</w:t>
+      </w:r>
+      <w:r>
+        <w:t xml:space="preserve"> (0→10 В) через </w:t>
+      </w:r>
+      <w:r>
+        <w:rPr>
+          <w:rFonts w:ascii="Consolas" w:hAnsi="Consolas"/>
+          <w:color w:val="C03030"/>
+          <w:sz w:val="20"/>
+        </w:rPr>
+        <w:t>R_g = 10 Ом</w:t>
+      </w:r>
+      <w:r>
+        <w:t>.</w:t>
+      </w:r>
+    </w:p>
+    <w:p>
+      <w:pPr>
+        <w:pStyle w:val="Heading3"/>
+      </w:pPr>
+      <w:r>
+        <w:t>B2. Двойной импульс</w:t>
+      </w:r>
+    </w:p>
+    <w:p>
+      <w:r>
+        <w:t>Импульсный источник на затвор (</w:t>
+      </w:r>
+      <w:r>
+        <w:rPr>
+          <w:rFonts w:ascii="Consolas" w:hAnsi="Consolas"/>
+          <w:color w:val="C03030"/>
+          <w:sz w:val="20"/>
+        </w:rPr>
+        <w:t>PULSE</w:t>
+      </w:r>
+      <w:r>
+        <w:t>): первый импульс задаёт ток в L, пауза, второй — для измерения включения при заданном токе.</w:t>
+      </w:r>
+    </w:p>
+    <w:p>
+      <w:r>
+        <w:t xml:space="preserve">Пример: </w:t>
+      </w:r>
+      <w:r>
+        <w:rPr>
+          <w:rFonts w:ascii="Consolas" w:hAnsi="Consolas"/>
+          <w:color w:val="C03030"/>
+          <w:sz w:val="20"/>
+        </w:rPr>
+        <w:t>PULSE(0 10 5u 10n 10n 10u 25u)</w:t>
+      </w:r>
+      <w:r>
+        <w:t xml:space="preserve"> (фронты 10 нс, ширина 10 мкс, период 25 мкс).</w:t>
+      </w:r>
+    </w:p>
+    <w:p>
+      <w:pPr>
+        <w:pStyle w:val="Heading3"/>
+      </w:pPr>
+      <w:r>
+        <w:t>B3. Анализ</w:t>
+      </w:r>
+    </w:p>
+    <w:p>
+      <w:pPr>
+        <w:pStyle w:val="ListNumber"/>
+      </w:pPr>
+      <w:r>
+        <w:t xml:space="preserve">Директива: </w:t>
+      </w:r>
+      <w:r>
+        <w:rPr>
+          <w:rFonts w:ascii="Consolas" w:hAnsi="Consolas"/>
+          <w:color w:val="C03030"/>
+          <w:sz w:val="20"/>
+        </w:rPr>
+        <w:t>.tran 0 40u 0 1n</w:t>
+      </w:r>
+      <w:r>
+        <w:t xml:space="preserve"> (мелкий шаг 1 нс для фронтов).</w:t>
+      </w:r>
+    </w:p>
+    <w:p>
+      <w:pPr>
+        <w:pStyle w:val="ListNumber"/>
+      </w:pPr>
+      <w:r>
+        <w:t xml:space="preserve">Снимите </w:t>
+      </w:r>
+      <w:r>
+        <w:rPr>
+          <w:rFonts w:ascii="Consolas" w:hAnsi="Consolas"/>
+          <w:color w:val="C03030"/>
+          <w:sz w:val="20"/>
+        </w:rPr>
+        <w:t>V(сток)</w:t>
+      </w:r>
+      <w:r>
+        <w:t xml:space="preserve">, </w:t>
+      </w:r>
+      <w:r>
+        <w:rPr>
+          <w:rFonts w:ascii="Consolas" w:hAnsi="Consolas"/>
+          <w:color w:val="C03030"/>
+          <w:sz w:val="20"/>
+        </w:rPr>
+        <w:t>Id(M1)</w:t>
+      </w:r>
+      <w:r>
+        <w:t xml:space="preserve">, </w:t>
+      </w:r>
+      <w:r>
+        <w:rPr>
+          <w:rFonts w:ascii="Consolas" w:hAnsi="Consolas"/>
+          <w:color w:val="C03030"/>
+          <w:sz w:val="20"/>
+        </w:rPr>
+        <w:t>V(затвор)</w:t>
+      </w:r>
+      <w:r>
+        <w:t xml:space="preserve">. Измерьте </w:t>
+      </w:r>
+      <w:r>
+        <w:rPr>
+          <w:rFonts w:ascii="Consolas" w:hAnsi="Consolas"/>
+          <w:color w:val="C03030"/>
+          <w:sz w:val="20"/>
+        </w:rPr>
+        <w:t>t_on</w:t>
+      </w:r>
+      <w:r>
+        <w:t xml:space="preserve">, </w:t>
+      </w:r>
+      <w:r>
+        <w:rPr>
+          <w:rFonts w:ascii="Consolas" w:hAnsi="Consolas"/>
+          <w:color w:val="C03030"/>
+          <w:sz w:val="20"/>
+        </w:rPr>
+        <w:t>t_off</w:t>
+      </w:r>
+      <w:r>
+        <w:t>.</w:t>
+      </w:r>
+    </w:p>
+    <w:p>
+      <w:pPr>
+        <w:pStyle w:val="ListNumber"/>
+      </w:pPr>
+      <w:r>
+        <w:t xml:space="preserve">Потери: добавьте выражение </w:t>
+      </w:r>
+      <w:r>
+        <w:rPr>
+          <w:rFonts w:ascii="Consolas" w:hAnsi="Consolas"/>
+          <w:color w:val="C03030"/>
+          <w:sz w:val="20"/>
+        </w:rPr>
+        <w:t>V(сток)*Id(M1)</w:t>
+      </w:r>
+      <w:r>
+        <w:t>, проинтегрируйте на интервалах коммутации (в окне waveform: ПКМ → Integrate).</w:t>
+      </w:r>
+    </w:p>
+    <w:p>
+      <w:pPr>
+        <w:pStyle w:val="Heading3"/>
+      </w:pPr>
+      <w:r>
+        <w:t>B4. Влияние R_g</w:t>
+      </w:r>
+    </w:p>
+    <w:p>
+      <w:r>
+        <w:t xml:space="preserve">Повторите для </w:t>
+      </w:r>
+      <w:r>
+        <w:rPr>
+          <w:rFonts w:ascii="Consolas" w:hAnsi="Consolas"/>
+          <w:color w:val="C03030"/>
+          <w:sz w:val="20"/>
+        </w:rPr>
+        <w:t>R_g = 4.7 Ом</w:t>
+      </w:r>
+      <w:r>
+        <w:t xml:space="preserve"> и </w:t>
+      </w:r>
+      <w:r>
+        <w:rPr>
+          <w:rFonts w:ascii="Consolas" w:hAnsi="Consolas"/>
+          <w:color w:val="C03030"/>
+          <w:sz w:val="20"/>
+        </w:rPr>
+        <w:t>R_g = 22 Ом</w:t>
+      </w:r>
+      <w:r>
+        <w:t>. Сравните скорость фронтов, потери и уровень звона (dV/dt).</w:t>
+      </w:r>
+    </w:p>
+    <w:p>
+      <w:r>
+        <w:t>────────────────────────────────────────</w:t>
+      </w:r>
+    </w:p>
+    <w:p>
+      <w:pPr>
+        <w:pStyle w:val="Heading2"/>
+      </w:pPr>
+      <w:r>
+        <w:t>Часть C. Сравнение с IGBT (опционально)</w:t>
+      </w:r>
+    </w:p>
+    <w:p>
+      <w:r>
+        <w:t xml:space="preserve">Замените MOSFET на IGBT-модель (например </w:t>
+      </w:r>
+      <w:r>
+        <w:rPr>
+          <w:rFonts w:ascii="Consolas" w:hAnsi="Consolas"/>
+          <w:color w:val="C03030"/>
+          <w:sz w:val="20"/>
+        </w:rPr>
+        <w:t>IRG4PC50U</w:t>
+      </w:r>
+      <w:r>
+        <w:t xml:space="preserve">). Повторите B1–B3. Обратите внимание на </w:t>
+      </w:r>
+      <w:r>
+        <w:rPr>
+          <w:b/>
+        </w:rPr>
+        <w:t>хвостовой ток</w:t>
+      </w:r>
+      <w:r>
+        <w:t xml:space="preserve"> при выключении — он увеличивает </w:t>
+      </w:r>
+      <w:r>
+        <w:rPr>
+          <w:rFonts w:ascii="Consolas" w:hAnsi="Consolas"/>
+          <w:color w:val="C03030"/>
+          <w:sz w:val="20"/>
+        </w:rPr>
+        <w:t>E_off</w:t>
+      </w:r>
+      <w:r>
+        <w:t>.</w:t>
+      </w:r>
+    </w:p>
+    <w:p>
+      <w:r>
+        <w:t>────────────────────────────────────────</w:t>
+      </w:r>
+    </w:p>
+    <w:p>
+      <w:pPr>
+        <w:pStyle w:val="Heading2"/>
+      </w:pPr>
+      <w:r>
+        <w:t>Таблица результатов</w:t>
+      </w:r>
+    </w:p>
+    <w:p>
+      <w:r>
+        <w:t>| Параметр | R_g=4.7 Ом | R_g=10 Ом | R_g=22 Ом | IGBT (R_g=10) |</w:t>
+      </w:r>
+    </w:p>
+    <w:p>
+      <w:r>
+        <w:t>|----------|------------|-----------|-----------|----------------|</w:t>
+      </w:r>
+    </w:p>
+    <w:p>
+      <w:r>
+        <w:t>| t_on, нс | | | | |</w:t>
+      </w:r>
+    </w:p>
+    <w:p>
+      <w:r>
+        <w:t>| t_off, нс | | | | |</w:t>
+      </w:r>
+    </w:p>
+    <w:p>
+      <w:r>
+        <w:t>| E_on, мкДж | | | | |</w:t>
+      </w:r>
+    </w:p>
+    <w:p>
+      <w:r>
+        <w:t>| E_off, мкДж | | | | |</w:t>
+      </w:r>
+    </w:p>
+    <w:p>
+      <w:r>
+        <w:t>| P_sw (50 кГц), Вт | | | | |</w:t>
+      </w:r>
+    </w:p>
+    <w:p>
+      <w:r>
+        <w:t>| Звон/перенапряжение | | | | |</w:t>
+      </w:r>
+    </w:p>
+    <w:p>
+      <w:r>
+        <w:t>────────────────────────────────────────</w:t>
       </w:r>
     </w:p>
     <w:p>
@@ -191,7 +776,18 @@
         <w:pStyle w:val="ListNumber"/>
       </w:pPr>
       <w:r>
-        <w:t>Как R_g влияет на потери и на уровень помех (dV/dt)?</w:t>
+        <w:t xml:space="preserve">Как </w:t>
+      </w:r>
+      <w:r>
+        <w:rPr>
+          <w:rFonts w:ascii="Consolas" w:hAnsi="Consolas"/>
+          <w:color w:val="C03030"/>
+          <w:sz w:val="20"/>
+        </w:rPr>
+        <w:t>R_g</w:t>
+      </w:r>
+      <w:r>
+        <w:t xml:space="preserve"> влияет на потери и на уровень помех (dV/dt)?</w:t>
       </w:r>
     </w:p>
     <w:p>
@@ -199,7 +795,7 @@
         <w:pStyle w:val="ListNumber"/>
       </w:pPr>
       <w:r>
-        <w:t>Откуда берётся «хвостовой ток» у IGBT и почему он увеличивает потери?</w:t>
+        <w:t>Откуда берётся хвостовой ток IGBT и почему он увеличивает потери?</w:t>
       </w:r>
     </w:p>
     <w:p>
@@ -207,7 +803,15 @@
         <w:pStyle w:val="ListNumber"/>
       </w:pPr>
       <w:r>
-        <w:t>Зачем нужен обратный (антипараллельный) диод при индуктивной нагрузке?</w:t>
+        <w:t>Зачем нужен обратный диод при индуктивной нагрузке?</w:t>
+      </w:r>
+    </w:p>
+    <w:p>
+      <w:pPr>
+        <w:pStyle w:val="ListNumber"/>
+      </w:pPr>
+      <w:r>
+        <w:t>Почему для анализа фронтов нужен малый шаг интегрирования (1 нс)?</w:t>
       </w:r>
     </w:p>
     <w:p>
@@ -220,7 +824,7 @@
     </w:p>
     <w:p>
       <w:r>
-        <w:t>Цель → характеристики → осциллограммы переключения → расчёт потерь → сравнение R_g (и MOSFET/IGBT) → выводы.</w:t>
+        <w:t>Цель → расчёт → характеристики → осциллограммы переключения → таблица (R_g, MOSFET/IGBT) → выводы.</w:t>
       </w:r>
     </w:p>
     <w:sectPr>

</xml_diff>